<commit_message>
Ed7 aflevering 8 toegevoegd: De pers, het volk, de bonden (tactische scharnier); persstrategie-secties in 05 en 07
</commit_message>
<xml_diff>
--- a/assets/downloads-editie-7/editie7_aflevering-05-drie-pilot-installaties.docx
+++ b/assets/downloads-editie-7/editie7_aflevering-05-drie-pilot-installaties.docx
@@ -140,6 +140,26 @@
     <w:p>
       <w:pPr>
         <w:pStyle w:val="FirstParagraph"/>
+      </w:pPr>
+      <w:r>
+        <w:rPr>
+          <w:b/>
+          <w:bCs/>
+        </w:rPr>
+        <w:t xml:space="preserve">Persstrategie per pilot — hoe de bonden worden gestuurd</w:t>
+      </w:r>
+    </w:p>
+    <w:p>
+      <w:pPr>
+        <w:pStyle w:val="BodyText"/>
+      </w:pPr>
+      <w:r>
+        <w:t xml:space="preserve">Elke pilot heeft een vakbond die als blokkadekracht kan optreden: FNV Havens bij Rotterdam, IG BCE bij Hamburg en Garzweiler, en lokale Nigeriaanse petroleumbonden bij Kaduna. Het mechanisme van aflevering 8 is niet onderhandelen met deze bonden, maar de pers in elk gebied wekelijks vullen met gemeten feiten: hoeveel banen levert de pilot (concreet, per regio), wat is de CO₂-balans (gemeten, niet beloofd), hoe ziet de werkgelegenheid eruit voor de bond-leden persoonlijk. Burgers — vrijwel allemaal bondleden in deze regio’s — lezen het, herkennen hun belang, en sturen hun bond op de algemene ledenvergadering. De bond corrigeert zichzelf binnen twee jaar, of verliest leden. In beide gevallen verdwijnt de blokkade. Dit is geen aanval op de bond; het is de bond toelaten zijn eigenlijke functie — werkgelegenheid en koopkracht beschermen — in een nieuwe industriestructuur uit te oefenen.</w:t>
+      </w:r>
+    </w:p>
+    <w:p>
+      <w:pPr>
+        <w:pStyle w:val="BodyText"/>
       </w:pPr>
       <w:r>
         <w:rPr>

</xml_diff>